<commit_message>
Correct professional evidence and add pre-publish manifest
</commit_message>
<xml_diff>
--- a/docs/professional-positioning/Oniel_Alejo_Feliz_Software_Engineer_Resume.docx
+++ b/docs/professional-positioning/Oniel_Alejo_Feliz_Software_Engineer_Resume.docx
@@ -20,7 +20,7 @@
     </w:p>
     <w:p>
       <w:pPr>
-        <w:spacing w:after="0" w:line="240" w:lineRule="auto"/>
+        <w:spacing w:after="0" w:line="254" w:lineRule="auto"/>
         <w:jc w:val="center"/>
       </w:pPr>
       <w:r>
@@ -37,14 +37,14 @@
           <w:rFonts w:ascii="Arial" w:hAnsi="Arial"/>
           <w:b w:val="0"/>
           <w:color w:val="3E454E"/>
-          <w:sz w:val="18"/>
+          <w:sz w:val="19"/>
         </w:rPr>
         <w:t xml:space="preserve">  |  TypeScript | Node.js | React / Next.js | PostgreSQL</w:t>
       </w:r>
     </w:p>
     <w:p>
       <w:pPr>
-        <w:spacing w:after="0" w:line="240" w:lineRule="auto"/>
+        <w:spacing w:after="0" w:line="254" w:lineRule="auto"/>
         <w:jc w:val="center"/>
       </w:pPr>
       <w:r>
@@ -52,14 +52,14 @@
           <w:rFonts w:ascii="Arial" w:hAnsi="Arial"/>
           <w:b w:val="0"/>
           <w:color w:val="000000"/>
-          <w:sz w:val="17"/>
+          <w:sz w:val="18"/>
         </w:rPr>
         <w:t>Tampa, FL | 656-200-7791 | Onielbf10@gmail.com</w:t>
       </w:r>
     </w:p>
     <w:p>
       <w:pPr>
-        <w:spacing w:after="0" w:line="240" w:lineRule="auto"/>
+        <w:spacing w:after="0" w:line="254" w:lineRule="auto"/>
         <w:jc w:val="center"/>
       </w:pPr>
       <w:hyperlink r:id="rId9">
@@ -68,7 +68,7 @@
             <w:rFonts w:ascii="Arial" w:hAnsi="Arial"/>
             <w:color w:val="1F4E79"/>
             <w:u w:val="single"/>
-            <w:sz w:val="17"/>
+            <w:sz w:val="18"/>
           </w:rPr>
           <w:t>oniel-portfolio.vercel.app</w:t>
         </w:r>
@@ -78,7 +78,7 @@
           <w:rFonts w:ascii="Arial" w:hAnsi="Arial"/>
           <w:b w:val="0"/>
           <w:color w:val="3E454E"/>
-          <w:sz w:val="17"/>
+          <w:sz w:val="18"/>
         </w:rPr>
         <w:t xml:space="preserve"> | </w:t>
       </w:r>
@@ -88,7 +88,7 @@
             <w:rFonts w:ascii="Arial" w:hAnsi="Arial"/>
             <w:color w:val="1F4E79"/>
             <w:u w:val="single"/>
-            <w:sz w:val="17"/>
+            <w:sz w:val="18"/>
           </w:rPr>
           <w:t>github.com/XonkelX</w:t>
         </w:r>
@@ -98,7 +98,7 @@
           <w:rFonts w:ascii="Arial" w:hAnsi="Arial"/>
           <w:b w:val="0"/>
           <w:color w:val="3E454E"/>
-          <w:sz w:val="17"/>
+          <w:sz w:val="18"/>
         </w:rPr>
         <w:t xml:space="preserve"> | </w:t>
       </w:r>
@@ -108,7 +108,7 @@
             <w:rFonts w:ascii="Arial" w:hAnsi="Arial"/>
             <w:color w:val="1F4E79"/>
             <w:u w:val="single"/>
-            <w:sz w:val="17"/>
+            <w:sz w:val="18"/>
           </w:rPr>
           <w:t>linkedin.com/in/oniel-alejo-feliz-45b293312</w:t>
         </w:r>
@@ -116,7 +116,7 @@
     </w:p>
     <w:p>
       <w:pPr>
-        <w:spacing w:after="0" w:line="240" w:lineRule="auto"/>
+        <w:spacing w:after="0" w:line="254" w:lineRule="auto"/>
         <w:jc w:val="center"/>
       </w:pPr>
       <w:r>
@@ -124,7 +124,7 @@
           <w:rFonts w:ascii="Arial" w:hAnsi="Arial"/>
           <w:b w:val="0"/>
           <w:color w:val="3E454E"/>
-          <w:sz w:val="16"/>
+          <w:sz w:val="17"/>
         </w:rPr>
         <w:t>U.S. permanent resident | No employer sponsorship required | English and Spanish</w:t>
       </w:r>
@@ -132,43 +132,43 @@
     <w:p>
       <w:pPr>
         <w:keepNext/>
-        <w:spacing w:before="90" w:after="30"/>
+        <w:spacing w:before="130" w:after="44"/>
       </w:pPr>
       <w:r>
         <w:rPr>
           <w:rFonts w:ascii="Arial" w:hAnsi="Arial"/>
           <w:b/>
           <w:color w:val="000000"/>
-          <w:sz w:val="18"/>
+          <w:sz w:val="20"/>
         </w:rPr>
         <w:t>SUMMARY</w:t>
       </w:r>
     </w:p>
     <w:p>
       <w:pPr>
-        <w:spacing w:after="0" w:line="240" w:lineRule="auto"/>
+        <w:spacing w:after="0" w:line="254" w:lineRule="auto"/>
       </w:pPr>
       <w:r>
         <w:rPr>
           <w:rFonts w:ascii="Arial" w:hAnsi="Arial"/>
           <w:b w:val="0"/>
           <w:color w:val="000000"/>
-          <w:sz w:val="17"/>
+          <w:sz w:val="18"/>
         </w:rPr>
-        <w:t>Software engineer focused on TypeScript systems, existing-codebase work, PostgreSQL data boundaries, APIs, reliability, and automated testing. Contributed maintainer-reviewed changes to Reticle, Apache Maka, Apache Fineract, Code.Sydney / BlueHex, and Clarvia, including substantive review revisions and regression coverage.</w:t>
+        <w:t>Software engineer with six merged upstream pull requests in established codebases, focused on TypeScript systems, PostgreSQL data boundaries, reliability, and automated testing. Work across Reticle, Apache Maka, Apache Fineract, Code.Sydney / BlueHex, and Clarvia includes substantive maintainer review and regression coverage.</w:t>
       </w:r>
     </w:p>
     <w:p>
       <w:pPr>
         <w:keepNext/>
-        <w:spacing w:before="90" w:after="30"/>
+        <w:spacing w:before="130" w:after="44"/>
       </w:pPr>
       <w:r>
         <w:rPr>
           <w:rFonts w:ascii="Arial" w:hAnsi="Arial"/>
           <w:b/>
           <w:color w:val="000000"/>
-          <w:sz w:val="18"/>
+          <w:sz w:val="20"/>
         </w:rPr>
         <w:t>OPEN-SOURCE ENGINEERING</w:t>
       </w:r>
@@ -176,14 +176,14 @@
     <w:p>
       <w:pPr>
         <w:keepNext/>
-        <w:spacing w:before="20" w:after="0"/>
+        <w:spacing w:before="30" w:after="8"/>
       </w:pPr>
       <w:r>
         <w:rPr>
           <w:rFonts w:ascii="Arial" w:hAnsi="Arial"/>
           <w:b/>
           <w:color w:val="000000"/>
-          <w:sz w:val="18"/>
+          <w:sz w:val="19"/>
         </w:rPr>
         <w:t>Open-Source Software Contributor - Independent</w:t>
       </w:r>
@@ -192,14 +192,14 @@
           <w:rFonts w:ascii="Arial" w:hAnsi="Arial"/>
           <w:b w:val="0"/>
           <w:color w:val="3E454E"/>
-          <w:sz w:val="17"/>
+          <w:sz w:val="18"/>
         </w:rPr>
         <w:t xml:space="preserve"> | 2026-Present</w:t>
       </w:r>
     </w:p>
     <w:p>
       <w:pPr>
-        <w:spacing w:after="14" w:line="240" w:lineRule="auto"/>
+        <w:spacing w:after="28" w:line="254" w:lineRule="auto"/>
         <w:ind w:left="245" w:hanging="187"/>
       </w:pPr>
       <w:r>
@@ -207,14 +207,14 @@
           <w:rFonts w:ascii="Arial" w:hAnsi="Arial"/>
           <w:b w:val="0"/>
           <w:color w:val="000000"/>
-          <w:sz w:val="17"/>
+          <w:sz w:val="18"/>
         </w:rPr>
-        <w:t>- Reticle #278: added bounded, batched learned-route persistence across crawls and navigation; preserved concurrent project state and exact optional semantics; passed full cross-platform, unit, E2E, desktop, and install gates after maintainer-requested revisions.</w:t>
+        <w:t>- Reticle #278: added bounded, batched learned-route persistence across crawls and navigation; preserved project state and exact optional semantics; revised the design after substantive maintainer review and merged after upstream validation.</w:t>
       </w:r>
     </w:p>
     <w:p>
       <w:pPr>
-        <w:spacing w:after="14" w:line="240" w:lineRule="auto"/>
+        <w:spacing w:after="28" w:line="254" w:lineRule="auto"/>
         <w:ind w:left="245" w:hanging="187"/>
       </w:pPr>
       <w:r>
@@ -222,14 +222,14 @@
           <w:rFonts w:ascii="Arial" w:hAnsi="Arial"/>
           <w:b w:val="0"/>
           <w:color w:val="000000"/>
-          <w:sz w:val="17"/>
+          <w:sz w:val="18"/>
         </w:rPr>
         <w:t>- Apache Maka #2989: stopped unbounded MCP tool rediscovery while preserving callable-tool snapshots; revised the design through multiple rounds of edge-case review and added slow-notification and snapshot-preservation regressions before merge.</w:t>
       </w:r>
     </w:p>
     <w:p>
       <w:pPr>
-        <w:spacing w:after="14" w:line="240" w:lineRule="auto"/>
+        <w:spacing w:after="28" w:line="254" w:lineRule="auto"/>
         <w:ind w:left="245" w:hanging="187"/>
       </w:pPr>
       <w:r>
@@ -237,14 +237,14 @@
           <w:rFonts w:ascii="Arial" w:hAnsi="Arial"/>
           <w:b w:val="0"/>
           <w:color w:val="000000"/>
-          <w:sz w:val="17"/>
+          <w:sz w:val="18"/>
         </w:rPr>
-        <w:t>- Apache Fineract #475 and #431: migrated 15 client-area specs to Vitest and added translation-backed titles across 28 Accounting routes; both merged after maintainer approval and full Apache validation.</w:t>
+        <w:t>- Apache Fineract #475 and #431: migrated the remaining 13 client-area Jasmine/Karma specs (73 tests) to Vitest and added translation-backed titles to 28 Accounting routes; both merged after upstream validation.</w:t>
       </w:r>
     </w:p>
     <w:p>
       <w:pPr>
-        <w:spacing w:after="14" w:line="240" w:lineRule="auto"/>
+        <w:spacing w:after="28" w:line="254" w:lineRule="auto"/>
         <w:ind w:left="245" w:hanging="187"/>
       </w:pPr>
       <w:r>
@@ -252,7 +252,7 @@
           <w:rFonts w:ascii="Arial" w:hAnsi="Arial"/>
           <w:b w:val="0"/>
           <w:color w:val="000000"/>
-          <w:sz w:val="17"/>
+          <w:sz w:val="18"/>
         </w:rPr>
         <w:t>- BlueHex #29 and Clarvia #269: added production-build Playwright coverage and fixed keyboard and screen-reader barriers; incorporated maintainer feedback before both changes merged.</w:t>
       </w:r>
@@ -260,14 +260,14 @@
     <w:p>
       <w:pPr>
         <w:keepNext/>
-        <w:spacing w:before="90" w:after="30"/>
+        <w:spacing w:before="130" w:after="44"/>
       </w:pPr>
       <w:r>
         <w:rPr>
           <w:rFonts w:ascii="Arial" w:hAnsi="Arial"/>
           <w:b/>
           <w:color w:val="000000"/>
-          <w:sz w:val="18"/>
+          <w:sz w:val="20"/>
         </w:rPr>
         <w:t>SELECTED ENGINEERING PROJECTS</w:t>
       </w:r>
@@ -275,14 +275,14 @@
     <w:p>
       <w:pPr>
         <w:keepNext/>
-        <w:spacing w:before="20" w:after="0"/>
+        <w:spacing w:before="30" w:after="8"/>
       </w:pPr>
       <w:r>
         <w:rPr>
           <w:rFonts w:ascii="Arial" w:hAnsi="Arial"/>
           <w:b/>
           <w:color w:val="000000"/>
-          <w:sz w:val="18"/>
+          <w:sz w:val="19"/>
         </w:rPr>
         <w:t>Relay - Webhook Delivery and Failure Recovery</w:t>
       </w:r>
@@ -291,14 +291,14 @@
           <w:rFonts w:ascii="Arial" w:hAnsi="Arial"/>
           <w:b w:val="0"/>
           <w:color w:val="3E454E"/>
-          <w:sz w:val="17"/>
+          <w:sz w:val="18"/>
         </w:rPr>
         <w:t xml:space="preserve"> | TypeScript | React | Cloudflare Workers | D1 | Queues</w:t>
       </w:r>
     </w:p>
     <w:p>
       <w:pPr>
-        <w:spacing w:after="14" w:line="240" w:lineRule="auto"/>
+        <w:spacing w:after="28" w:line="254" w:lineRule="auto"/>
         <w:ind w:left="245" w:hanging="187"/>
       </w:pPr>
       <w:r>
@@ -306,7 +306,7 @@
           <w:rFonts w:ascii="Arial" w:hAnsi="Arial"/>
           <w:b w:val="0"/>
           <w:color w:val="000000"/>
-          <w:sz w:val="17"/>
+          <w:sz w:val="18"/>
         </w:rPr>
         <w:t>- Implemented a transactional outbox, durable scheduling, signed requests, deterministic retries, lease recovery, encrypted endpoint secrets, replay lineage, and inspectable failure evidence. Source: github.com/XonkelX/relay-webhook-delivery</w:t>
       </w:r>
@@ -314,14 +314,14 @@
     <w:p>
       <w:pPr>
         <w:keepNext/>
-        <w:spacing w:before="20" w:after="0"/>
+        <w:spacing w:before="30" w:after="8"/>
       </w:pPr>
       <w:r>
         <w:rPr>
           <w:rFonts w:ascii="Arial" w:hAnsi="Arial"/>
           <w:b/>
           <w:color w:val="000000"/>
-          <w:sz w:val="18"/>
+          <w:sz w:val="19"/>
         </w:rPr>
         <w:t>Next - Real-Time Queue and Authorization</w:t>
       </w:r>
@@ -330,14 +330,14 @@
           <w:rFonts w:ascii="Arial" w:hAnsi="Arial"/>
           <w:b w:val="0"/>
           <w:color w:val="3E454E"/>
-          <w:sz w:val="17"/>
+          <w:sz w:val="18"/>
         </w:rPr>
         <w:t xml:space="preserve"> | Next.js | Supabase | PostgreSQL | Playwright</w:t>
       </w:r>
     </w:p>
     <w:p>
       <w:pPr>
-        <w:spacing w:after="14" w:line="240" w:lineRule="auto"/>
+        <w:spacing w:after="28" w:line="254" w:lineRule="auto"/>
         <w:ind w:left="245" w:hanging="187"/>
       </w:pPr>
       <w:r>
@@ -345,7 +345,7 @@
           <w:rFonts w:ascii="Arial" w:hAnsi="Arial"/>
           <w:b w:val="0"/>
           <w:color w:val="000000"/>
-          <w:sz w:val="17"/>
+          <w:sz w:val="18"/>
         </w:rPr>
         <w:t>- Enforced RLS, private/public data boundaries, transactional commands, idempotency, and concurrency in PostgreSQL; synchronized customer, staff, and public views with Realtime plus authoritative recovery. Source: github.com/XonkelX/next-queue</w:t>
       </w:r>
@@ -353,14 +353,14 @@
     <w:p>
       <w:pPr>
         <w:keepNext/>
-        <w:spacing w:before="90" w:after="30"/>
+        <w:spacing w:before="130" w:after="44"/>
       </w:pPr>
       <w:r>
         <w:rPr>
           <w:rFonts w:ascii="Arial" w:hAnsi="Arial"/>
           <w:b/>
           <w:color w:val="000000"/>
-          <w:sz w:val="18"/>
+          <w:sz w:val="20"/>
         </w:rPr>
         <w:t>ADDITIONAL EXPERIENCE</w:t>
       </w:r>
@@ -368,14 +368,14 @@
     <w:p>
       <w:pPr>
         <w:keepNext/>
-        <w:spacing w:before="20" w:after="0"/>
+        <w:spacing w:before="30" w:after="8"/>
       </w:pPr>
       <w:r>
         <w:rPr>
           <w:rFonts w:ascii="Arial" w:hAnsi="Arial"/>
           <w:b/>
           <w:color w:val="000000"/>
-          <w:sz w:val="18"/>
+          <w:sz w:val="19"/>
         </w:rPr>
         <w:t>AI Training Contributor - Outlier</w:t>
       </w:r>
@@ -384,14 +384,14 @@
           <w:rFonts w:ascii="Arial" w:hAnsi="Arial"/>
           <w:b w:val="0"/>
           <w:color w:val="3E454E"/>
-          <w:sz w:val="17"/>
+          <w:sz w:val="18"/>
         </w:rPr>
         <w:t xml:space="preserve"> | Remote | Jul 2024-Feb 2025</w:t>
       </w:r>
     </w:p>
     <w:p>
       <w:pPr>
-        <w:spacing w:after="14" w:line="240" w:lineRule="auto"/>
+        <w:spacing w:after="28" w:line="254" w:lineRule="auto"/>
         <w:ind w:left="245" w:hanging="187"/>
       </w:pPr>
       <w:r>
@@ -399,7 +399,7 @@
           <w:rFonts w:ascii="Arial" w:hAnsi="Arial"/>
           <w:b w:val="0"/>
           <w:color w:val="000000"/>
-          <w:sz w:val="17"/>
+          <w:sz w:val="18"/>
         </w:rPr>
         <w:t>- Completed varied AI-training work under detailed, changing evaluation criteria using independent reasoning, careful guideline interpretation, and consistent quality control.</w:t>
       </w:r>
@@ -407,14 +407,14 @@
     <w:p>
       <w:pPr>
         <w:keepNext/>
-        <w:spacing w:before="20" w:after="0"/>
+        <w:spacing w:before="30" w:after="8"/>
       </w:pPr>
       <w:r>
         <w:rPr>
           <w:rFonts w:ascii="Arial" w:hAnsi="Arial"/>
           <w:b/>
           <w:color w:val="000000"/>
-          <w:sz w:val="18"/>
+          <w:sz w:val="19"/>
         </w:rPr>
         <w:t>Computer Repair Technician - Local Computer Repair Shop</w:t>
       </w:r>
@@ -423,14 +423,14 @@
           <w:rFonts w:ascii="Arial" w:hAnsi="Arial"/>
           <w:b w:val="0"/>
           <w:color w:val="3E454E"/>
-          <w:sz w:val="17"/>
+          <w:sz w:val="18"/>
         </w:rPr>
         <w:t xml:space="preserve"> | 2024 | Six months</w:t>
       </w:r>
     </w:p>
     <w:p>
       <w:pPr>
-        <w:spacing w:after="14" w:line="240" w:lineRule="auto"/>
+        <w:spacing w:after="28" w:line="254" w:lineRule="auto"/>
         <w:ind w:left="245" w:hanging="187"/>
       </w:pPr>
       <w:r>
@@ -438,7 +438,7 @@
           <w:rFonts w:ascii="Arial" w:hAnsi="Arial"/>
           <w:b w:val="0"/>
           <w:color w:val="000000"/>
-          <w:sz w:val="17"/>
+          <w:sz w:val="18"/>
         </w:rPr>
         <w:t>- Diagnosed operating-system, application, and hardware failures; completed software and component repairs; explained practical solutions clearly to customers.</w:t>
       </w:r>
@@ -446,28 +446,28 @@
     <w:p>
       <w:pPr>
         <w:keepNext/>
-        <w:spacing w:before="90" w:after="30"/>
+        <w:spacing w:before="130" w:after="44"/>
       </w:pPr>
       <w:r>
         <w:rPr>
           <w:rFonts w:ascii="Arial" w:hAnsi="Arial"/>
           <w:b/>
           <w:color w:val="000000"/>
-          <w:sz w:val="18"/>
+          <w:sz w:val="20"/>
         </w:rPr>
         <w:t>TECHNICAL SKILLS</w:t>
       </w:r>
     </w:p>
     <w:p>
       <w:pPr>
-        <w:spacing w:after="0" w:line="240" w:lineRule="auto"/>
+        <w:spacing w:after="0" w:line="254" w:lineRule="auto"/>
       </w:pPr>
       <w:r>
         <w:rPr>
           <w:rFonts w:ascii="Arial" w:hAnsi="Arial"/>
           <w:b w:val="0"/>
           <w:color w:val="000000"/>
-          <w:sz w:val="17"/>
+          <w:sz w:val="18"/>
         </w:rPr>
         <w:t>TypeScript, JavaScript, SQL, React, Next.js, Node.js, REST APIs, PostgreSQL, Supabase, RLS, Prisma, Auth.js, Cloudflare Workers, D1, Queues, Hono, Vitest, Testing Library, Playwright, pgTAP, GitHub Actions, Docker, Vercel, accessibility</w:t>
       </w:r>
@@ -475,28 +475,28 @@
     <w:p>
       <w:pPr>
         <w:keepNext/>
-        <w:spacing w:before="90" w:after="30"/>
+        <w:spacing w:before="130" w:after="44"/>
       </w:pPr>
       <w:r>
         <w:rPr>
           <w:rFonts w:ascii="Arial" w:hAnsi="Arial"/>
           <w:b/>
           <w:color w:val="000000"/>
-          <w:sz w:val="18"/>
+          <w:sz w:val="20"/>
         </w:rPr>
         <w:t>EDUCATION</w:t>
       </w:r>
     </w:p>
     <w:p>
       <w:pPr>
-        <w:spacing w:after="0" w:line="240" w:lineRule="auto"/>
+        <w:spacing w:after="0" w:line="254" w:lineRule="auto"/>
       </w:pPr>
       <w:r>
         <w:rPr>
           <w:rFonts w:ascii="Arial" w:hAnsi="Arial"/>
           <w:b w:val="0"/>
           <w:color w:val="000000"/>
-          <w:sz w:val="17"/>
+          <w:sz w:val="18"/>
         </w:rPr>
         <w:t>Software Development Studies - Instituto Tecnologico de Las Americas (ITLA), Dominican Republic | Coursework completed</w:t>
       </w:r>
@@ -877,7 +877,7 @@
     <w:rPr>
       <w:rFonts w:ascii="Arial" w:hAnsi="Arial"/>
       <w:color w:val="000000"/>
-      <w:sz w:val="18"/>
+      <w:sz w:val="19"/>
     </w:rPr>
   </w:style>
   <w:style w:type="paragraph" w:styleId="Header">

</xml_diff>

<commit_message>
Remove education and refine scoped Contra offers
</commit_message>
<xml_diff>
--- a/docs/professional-positioning/Oniel_Alejo_Feliz_Software_Engineer_Resume.docx
+++ b/docs/professional-positioning/Oniel_Alejo_Feliz_Software_Engineer_Resume.docx
@@ -472,35 +472,6 @@
         <w:t>TypeScript, JavaScript, SQL, React, Next.js, Node.js, REST APIs, PostgreSQL, Supabase, RLS, Prisma, Auth.js, Cloudflare Workers, D1, Queues, Hono, Vitest, Testing Library, Playwright, pgTAP, GitHub Actions, Docker, Vercel, accessibility</w:t>
       </w:r>
     </w:p>
-    <w:p>
-      <w:pPr>
-        <w:keepNext/>
-        <w:spacing w:before="130" w:after="44"/>
-      </w:pPr>
-      <w:r>
-        <w:rPr>
-          <w:rFonts w:ascii="Arial" w:hAnsi="Arial"/>
-          <w:b/>
-          <w:color w:val="000000"/>
-          <w:sz w:val="20"/>
-        </w:rPr>
-        <w:t>EDUCATION</w:t>
-      </w:r>
-    </w:p>
-    <w:p>
-      <w:pPr>
-        <w:spacing w:after="0" w:line="254" w:lineRule="auto"/>
-      </w:pPr>
-      <w:r>
-        <w:rPr>
-          <w:rFonts w:ascii="Arial" w:hAnsi="Arial"/>
-          <w:b w:val="0"/>
-          <w:color w:val="000000"/>
-          <w:sz w:val="18"/>
-        </w:rPr>
-        <w:t>Software Development Studies - Instituto Tecnologico de Las Americas (ITLA), Dominican Republic | Coursework completed</w:t>
-      </w:r>
-    </w:p>
     <w:sectPr>
       <w:pgSz w:w="12240" w:h="15840"/>
       <w:pgMar w:top="835" w:right="792" w:bottom="605" w:left="792" w:header="720" w:footer="720" w:gutter="0"/>

</xml_diff>

<commit_message>
Use custom portfolio domain everywhere
</commit_message>
<xml_diff>
--- a/docs/professional-positioning/Oniel_Alejo_Feliz_Software_Engineer_Resume.docx
+++ b/docs/professional-positioning/Oniel_Alejo_Feliz_Software_Engineer_Resume.docx
@@ -70,7 +70,7 @@
             <w:u w:val="single"/>
             <w:sz w:val="18"/>
           </w:rPr>
-          <w:t>oniel-portfolio.vercel.app</w:t>
+          <w:t>onielalejofeliz.space</w:t>
         </w:r>
       </w:hyperlink>
       <w:r>
@@ -155,7 +155,7 @@
           <w:color w:val="000000"/>
           <w:sz w:val="18"/>
         </w:rPr>
-        <w:t>Software engineer with six merged upstream pull requests in established codebases, focused on TypeScript systems, PostgreSQL data boundaries, reliability, and automated testing. Work across Reticle, Apache Maka, Apache Fineract, Code.Sydney / BlueHex, and Clarvia includes substantive maintainer review and regression coverage.</w:t>
+        <w:t>Software engineer with merged upstream work in established codebases, focused on TypeScript systems, PostgreSQL data boundaries, reliability, and automated testing. Work across Reticle, Apache Maka, Apache Fineract, Code.Sydney / BlueHex, and Clarvia includes substantive maintainer review and regression coverage.</w:t>
       </w:r>
     </w:p>
     <w:p>

</xml_diff>